<commit_message>
fix: all problems, expect diagram and rooms, area
</commit_message>
<xml_diff>
--- a/inno-de-lab_task_2/УПРАВЛЕНИЕ АРЕНДНОЙ НЕДВИЖИМОСТЬЮ.docx
+++ b/inno-de-lab_task_2/УПРАВЛЕНИЕ АРЕНДНОЙ НЕДВИЖИМОСТЬЮ.docx
@@ -530,13 +530,23 @@
           <w:lang w:val="en-US"/>
         </w:rPr>
       </w:pPr>
-      <w:r>
-        <w:rPr>
-          <w:b/>
-          <w:sz w:val="28"/>
-          <w:lang w:val="en-US"/>
-        </w:rPr>
-        <w:t>Age:</w:t>
+      <w:proofErr w:type="spellStart"/>
+      <w:r>
+        <w:rPr>
+          <w:b/>
+          <w:sz w:val="28"/>
+          <w:lang w:val="en-US"/>
+        </w:rPr>
+        <w:t>DateOfBirthday</w:t>
+      </w:r>
+      <w:proofErr w:type="spellEnd"/>
+      <w:r>
+        <w:rPr>
+          <w:b/>
+          <w:sz w:val="28"/>
+          <w:lang w:val="en-US"/>
+        </w:rPr>
+        <w:t>:</w:t>
       </w:r>
       <w:r>
         <w:rPr>
@@ -550,7 +560,7 @@
           <w:sz w:val="28"/>
           <w:lang w:val="en-US"/>
         </w:rPr>
-        <w:t>INTEGER</w:t>
+        <w:t>DATE</w:t>
       </w:r>
       <w:r>
         <w:rPr>
@@ -623,48 +633,46 @@
           <w:lang w:val="en-US"/>
         </w:rPr>
       </w:pPr>
-      <w:r>
-        <w:rPr>
-          <w:b/>
-          <w:sz w:val="28"/>
-          <w:lang w:val="en-US"/>
-        </w:rPr>
-        <w:t xml:space="preserve">CHK_TenantAge: </w:t>
-      </w:r>
-      <w:r>
-        <w:rPr>
-          <w:sz w:val="28"/>
-          <w:lang w:val="en-US"/>
-        </w:rPr>
-        <w:t>CHECK</w:t>
-      </w:r>
-      <w:r>
-        <w:rPr>
-          <w:sz w:val="28"/>
-          <w:lang w:val="en-US"/>
-        </w:rPr>
-        <w:t xml:space="preserve"> (Age &gt;= 18</w:t>
-      </w:r>
-      <w:r>
-        <w:rPr>
-          <w:sz w:val="28"/>
-          <w:lang w:val="en-US"/>
-        </w:rPr>
-        <w:t xml:space="preserve"> AND </w:t>
-      </w:r>
-      <w:r>
-        <w:rPr>
-          <w:sz w:val="28"/>
-          <w:lang w:val="en-US"/>
-        </w:rPr>
-        <w:t xml:space="preserve">Age </w:t>
-      </w:r>
-      <w:r>
-        <w:rPr>
-          <w:sz w:val="28"/>
-          <w:lang w:val="en-US"/>
-        </w:rPr>
-        <w:t>&lt;=300)</w:t>
+      <w:proofErr w:type="spellStart"/>
+      <w:r>
+        <w:rPr>
+          <w:b/>
+          <w:sz w:val="28"/>
+          <w:lang w:val="en-US"/>
+        </w:rPr>
+        <w:t>CHK_TenantAge</w:t>
+      </w:r>
+      <w:proofErr w:type="spellEnd"/>
+      <w:r>
+        <w:rPr>
+          <w:b/>
+          <w:sz w:val="28"/>
+          <w:lang w:val="en-US"/>
+        </w:rPr>
+        <w:t xml:space="preserve">: </w:t>
+      </w:r>
+      <w:r>
+        <w:rPr>
+          <w:sz w:val="28"/>
+          <w:lang w:val="en-US"/>
+        </w:rPr>
+        <w:t>CHECK (</w:t>
+      </w:r>
+      <w:proofErr w:type="spellStart"/>
+      <w:r>
+        <w:rPr>
+          <w:sz w:val="28"/>
+          <w:lang w:val="en-US"/>
+        </w:rPr>
+        <w:t>DateOfBirthday</w:t>
+      </w:r>
+      <w:proofErr w:type="spellEnd"/>
+      <w:r>
+        <w:rPr>
+          <w:sz w:val="28"/>
+          <w:lang w:val="en-US"/>
+        </w:rPr>
+        <w:t xml:space="preserve"> &gt;= 1900)</w:t>
       </w:r>
     </w:p>
     <w:p>
@@ -980,8 +988,6 @@
         </w:rPr>
         <w:t>REAL</w:t>
       </w:r>
-      <w:bookmarkStart w:id="0" w:name="_GoBack"/>
-      <w:bookmarkEnd w:id="0"/>
       <w:r>
         <w:rPr>
           <w:sz w:val="28"/>
@@ -1357,14 +1363,7 @@
           <w:sz w:val="28"/>
           <w:lang w:val="en-US"/>
         </w:rPr>
-        <w:t xml:space="preserve"> DEFAULT </w:t>
-      </w:r>
-      <w:r>
-        <w:rPr>
-          <w:sz w:val="28"/>
-          <w:lang w:val="en-US"/>
-        </w:rPr>
-        <w:t>‘Other’</w:t>
+        <w:t xml:space="preserve"> DEFAULT ‘Other’</w:t>
       </w:r>
       <w:r>
         <w:rPr>
@@ -1555,7 +1554,7 @@
         </w:rPr>
         <w:t>PK_</w:t>
       </w:r>
-      <w:bookmarkStart w:id="1" w:name="_Hlk237161244"/>
+      <w:bookmarkStart w:id="0" w:name="_Hlk237161244"/>
       <w:r>
         <w:rPr>
           <w:b/>
@@ -1564,7 +1563,7 @@
         </w:rPr>
         <w:t>RequestId</w:t>
       </w:r>
-      <w:bookmarkEnd w:id="1"/>
+      <w:bookmarkEnd w:id="0"/>
       <w:r>
         <w:rPr>
           <w:b/>
@@ -1608,34 +1607,155 @@
           <w:lang w:val="en-US"/>
         </w:rPr>
       </w:pPr>
-      <w:r>
-        <w:rPr>
-          <w:b/>
-          <w:sz w:val="28"/>
-          <w:lang w:val="en-US"/>
-        </w:rPr>
-        <w:t xml:space="preserve">CHK_Created: </w:t>
-      </w:r>
-      <w:r>
-        <w:rPr>
-          <w:sz w:val="28"/>
-          <w:lang w:val="en-US"/>
-        </w:rPr>
-        <w:t xml:space="preserve">CHECK (Created </w:t>
-      </w:r>
-      <w:r>
-        <w:rPr>
-          <w:sz w:val="28"/>
-          <w:lang w:val="en-US"/>
-        </w:rPr>
-        <w:t>&lt;</w:t>
-      </w:r>
-      <w:r>
-        <w:rPr>
-          <w:sz w:val="28"/>
-          <w:lang w:val="en-US"/>
-        </w:rPr>
-        <w:t>= CURRENT_DATE)</w:t>
+      <w:proofErr w:type="spellStart"/>
+      <w:r>
+        <w:rPr>
+          <w:b/>
+          <w:sz w:val="28"/>
+          <w:lang w:val="en-US"/>
+        </w:rPr>
+        <w:t>FK_Requests_RealtyTenant</w:t>
+      </w:r>
+      <w:proofErr w:type="spellEnd"/>
+      <w:r>
+        <w:rPr>
+          <w:b/>
+          <w:sz w:val="28"/>
+          <w:lang w:val="en-US"/>
+        </w:rPr>
+        <w:t>:</w:t>
+      </w:r>
+      <w:r>
+        <w:rPr>
+          <w:sz w:val="28"/>
+          <w:lang w:val="en-US"/>
+        </w:rPr>
+        <w:t xml:space="preserve"> FOREIGN KEY (</w:t>
+      </w:r>
+      <w:proofErr w:type="spellStart"/>
+      <w:r>
+        <w:rPr>
+          <w:sz w:val="28"/>
+          <w:lang w:val="en-US"/>
+        </w:rPr>
+        <w:t>RealtyId</w:t>
+      </w:r>
+      <w:proofErr w:type="spellEnd"/>
+      <w:r>
+        <w:rPr>
+          <w:sz w:val="28"/>
+          <w:lang w:val="en-US"/>
+        </w:rPr>
+        <w:t xml:space="preserve">, TenantId) REFERENCES </w:t>
+      </w:r>
+      <w:proofErr w:type="gramStart"/>
+      <w:r>
+        <w:rPr>
+          <w:sz w:val="28"/>
+          <w:lang w:val="en-US"/>
+        </w:rPr>
+        <w:t>Contracts</w:t>
+      </w:r>
+      <w:r>
+        <w:rPr>
+          <w:sz w:val="28"/>
+          <w:lang w:val="en-US"/>
+        </w:rPr>
+        <w:t>(</w:t>
+      </w:r>
+      <w:proofErr w:type="gramEnd"/>
+      <w:r>
+        <w:rPr>
+          <w:sz w:val="28"/>
+          <w:lang w:val="en-US"/>
+        </w:rPr>
+        <w:t>RealtyId, TenantId)</w:t>
+      </w:r>
+    </w:p>
+    <w:p>
+      <w:pPr>
+        <w:pStyle w:val="a3"/>
+        <w:numPr>
+          <w:ilvl w:val="0"/>
+          <w:numId w:val="2"/>
+        </w:numPr>
+        <w:rPr>
+          <w:b/>
+          <w:sz w:val="28"/>
+          <w:lang w:val="en-US"/>
+        </w:rPr>
+      </w:pPr>
+      <w:r>
+        <w:rPr>
+          <w:b/>
+          <w:sz w:val="28"/>
+          <w:lang w:val="en-US"/>
+        </w:rPr>
+        <w:t xml:space="preserve">Table name: </w:t>
+      </w:r>
+      <w:r>
+        <w:rPr>
+          <w:sz w:val="28"/>
+          <w:lang w:val="en-US"/>
+        </w:rPr>
+        <w:t>Contracts</w:t>
+      </w:r>
+    </w:p>
+    <w:p>
+      <w:pPr>
+        <w:pStyle w:val="a3"/>
+        <w:numPr>
+          <w:ilvl w:val="1"/>
+          <w:numId w:val="2"/>
+        </w:numPr>
+        <w:rPr>
+          <w:b/>
+          <w:sz w:val="28"/>
+          <w:lang w:val="en-US"/>
+        </w:rPr>
+      </w:pPr>
+      <w:r>
+        <w:rPr>
+          <w:b/>
+          <w:sz w:val="28"/>
+          <w:lang w:val="en-US"/>
+        </w:rPr>
+        <w:t>Description:</w:t>
+      </w:r>
+      <w:r>
+        <w:rPr>
+          <w:sz w:val="28"/>
+          <w:lang w:val="en-US"/>
+        </w:rPr>
+        <w:t xml:space="preserve"> </w:t>
+      </w:r>
+      <w:r>
+        <w:rPr>
+          <w:sz w:val="28"/>
+        </w:rPr>
+        <w:t>Договоры аренды недвижимости</w:t>
+      </w:r>
+    </w:p>
+    <w:p>
+      <w:pPr>
+        <w:pStyle w:val="a3"/>
+        <w:numPr>
+          <w:ilvl w:val="1"/>
+          <w:numId w:val="2"/>
+        </w:numPr>
+        <w:rPr>
+          <w:b/>
+          <w:sz w:val="28"/>
+          <w:lang w:val="en-US"/>
+        </w:rPr>
+      </w:pPr>
+      <w:r>
+        <w:rPr>
+          <w:b/>
+          <w:sz w:val="28"/>
+          <w:lang w:val="en-US"/>
+        </w:rPr>
+        <w:t>Attributes:</w:t>
       </w:r>
     </w:p>
     <w:p>
@@ -1657,123 +1777,14 @@
           <w:sz w:val="28"/>
           <w:lang w:val="en-US"/>
         </w:rPr>
-        <w:t>FK_Requests_RealtyTenant:</w:t>
-      </w:r>
-      <w:r>
-        <w:rPr>
-          <w:sz w:val="28"/>
-          <w:lang w:val="en-US"/>
-        </w:rPr>
-        <w:t xml:space="preserve"> FOREIGN KEY (RealtyId, TenantId) REFERENCES </w:t>
-      </w:r>
-      <w:proofErr w:type="gramStart"/>
-      <w:r>
-        <w:rPr>
-          <w:sz w:val="28"/>
-          <w:lang w:val="en-US"/>
-        </w:rPr>
-        <w:t>Contracts</w:t>
-      </w:r>
-      <w:r>
-        <w:rPr>
-          <w:sz w:val="28"/>
-          <w:lang w:val="en-US"/>
-        </w:rPr>
-        <w:t>(</w:t>
-      </w:r>
-      <w:proofErr w:type="gramEnd"/>
-      <w:r>
-        <w:rPr>
-          <w:sz w:val="28"/>
-          <w:lang w:val="en-US"/>
-        </w:rPr>
-        <w:t>RealtyId, TenantId)</w:t>
-      </w:r>
-    </w:p>
-    <w:p>
-      <w:pPr>
-        <w:pStyle w:val="a3"/>
-        <w:numPr>
-          <w:ilvl w:val="0"/>
-          <w:numId w:val="2"/>
-        </w:numPr>
-        <w:rPr>
-          <w:b/>
-          <w:sz w:val="28"/>
-          <w:lang w:val="en-US"/>
-        </w:rPr>
-      </w:pPr>
-      <w:r>
-        <w:rPr>
-          <w:b/>
-          <w:sz w:val="28"/>
-          <w:lang w:val="en-US"/>
-        </w:rPr>
-        <w:t xml:space="preserve">Table name: </w:t>
-      </w:r>
-      <w:r>
-        <w:rPr>
-          <w:sz w:val="28"/>
-          <w:lang w:val="en-US"/>
-        </w:rPr>
-        <w:t>Contracts</w:t>
-      </w:r>
-    </w:p>
-    <w:p>
-      <w:pPr>
-        <w:pStyle w:val="a3"/>
-        <w:numPr>
-          <w:ilvl w:val="1"/>
-          <w:numId w:val="2"/>
-        </w:numPr>
-        <w:rPr>
-          <w:b/>
-          <w:sz w:val="28"/>
-          <w:lang w:val="en-US"/>
-        </w:rPr>
-      </w:pPr>
-      <w:r>
-        <w:rPr>
-          <w:b/>
-          <w:sz w:val="28"/>
-          <w:lang w:val="en-US"/>
-        </w:rPr>
-        <w:t>Description:</w:t>
-      </w:r>
-      <w:r>
-        <w:rPr>
-          <w:sz w:val="28"/>
-          <w:lang w:val="en-US"/>
-        </w:rPr>
-        <w:t xml:space="preserve"> </w:t>
-      </w:r>
-      <w:r>
-        <w:rPr>
-          <w:sz w:val="28"/>
-        </w:rPr>
-        <w:t>Договоры аренды недвижимости</w:t>
-      </w:r>
-    </w:p>
-    <w:p>
-      <w:pPr>
-        <w:pStyle w:val="a3"/>
-        <w:numPr>
-          <w:ilvl w:val="1"/>
-          <w:numId w:val="2"/>
-        </w:numPr>
-        <w:rPr>
-          <w:b/>
-          <w:sz w:val="28"/>
-          <w:lang w:val="en-US"/>
-        </w:rPr>
-      </w:pPr>
-      <w:r>
-        <w:rPr>
-          <w:b/>
-          <w:sz w:val="28"/>
-          <w:lang w:val="en-US"/>
-        </w:rPr>
-        <w:t>Attributes:</w:t>
+        <w:t xml:space="preserve">ContractId: </w:t>
+      </w:r>
+      <w:r>
+        <w:rPr>
+          <w:sz w:val="28"/>
+          <w:lang w:val="en-US"/>
+        </w:rPr>
+        <w:t>INTEGER, PK</w:t>
       </w:r>
     </w:p>
     <w:p>
@@ -1795,14 +1806,14 @@
           <w:sz w:val="28"/>
           <w:lang w:val="en-US"/>
         </w:rPr>
-        <w:t xml:space="preserve">ContractId: </w:t>
-      </w:r>
-      <w:r>
-        <w:rPr>
-          <w:sz w:val="28"/>
-          <w:lang w:val="en-US"/>
-        </w:rPr>
-        <w:t>INTEGER, PK</w:t>
+        <w:t>TenantId:</w:t>
+      </w:r>
+      <w:r>
+        <w:rPr>
+          <w:sz w:val="28"/>
+          <w:lang w:val="en-US"/>
+        </w:rPr>
+        <w:t xml:space="preserve"> INTEGER, FK</w:t>
       </w:r>
     </w:p>
     <w:p>
@@ -1824,7 +1835,7 @@
           <w:sz w:val="28"/>
           <w:lang w:val="en-US"/>
         </w:rPr>
-        <w:t>TenantId:</w:t>
+        <w:t>RealtyId:</w:t>
       </w:r>
       <w:r>
         <w:rPr>
@@ -1853,14 +1864,21 @@
           <w:sz w:val="28"/>
           <w:lang w:val="en-US"/>
         </w:rPr>
-        <w:t>RealtyId:</w:t>
-      </w:r>
-      <w:r>
-        <w:rPr>
-          <w:sz w:val="28"/>
-          <w:lang w:val="en-US"/>
-        </w:rPr>
-        <w:t xml:space="preserve"> INTEGER, FK</w:t>
+        <w:t xml:space="preserve">ContractText: </w:t>
+      </w:r>
+      <w:r>
+        <w:rPr>
+          <w:sz w:val="28"/>
+          <w:lang w:val="en-US"/>
+        </w:rPr>
+        <w:t>TEXT</w:t>
+      </w:r>
+      <w:r>
+        <w:rPr>
+          <w:sz w:val="28"/>
+          <w:lang w:val="en-US"/>
+        </w:rPr>
+        <w:t>, NOT NULL</w:t>
       </w:r>
     </w:p>
     <w:p>
@@ -1876,20 +1894,30 @@
           <w:lang w:val="en-US"/>
         </w:rPr>
       </w:pPr>
-      <w:r>
-        <w:rPr>
-          <w:b/>
-          <w:sz w:val="28"/>
-          <w:lang w:val="en-US"/>
-        </w:rPr>
-        <w:t xml:space="preserve">ContractText: </w:t>
-      </w:r>
-      <w:r>
-        <w:rPr>
-          <w:sz w:val="28"/>
-          <w:lang w:val="en-US"/>
-        </w:rPr>
-        <w:t>TEXT</w:t>
+      <w:proofErr w:type="spellStart"/>
+      <w:r>
+        <w:rPr>
+          <w:b/>
+          <w:sz w:val="28"/>
+          <w:lang w:val="en-US"/>
+        </w:rPr>
+        <w:t>ContractStartDay</w:t>
+      </w:r>
+      <w:proofErr w:type="spellEnd"/>
+      <w:r>
+        <w:rPr>
+          <w:b/>
+          <w:sz w:val="28"/>
+          <w:lang w:val="en-US"/>
+        </w:rPr>
+        <w:t xml:space="preserve">: </w:t>
+      </w:r>
+      <w:r>
+        <w:rPr>
+          <w:sz w:val="28"/>
+          <w:lang w:val="en-US"/>
+        </w:rPr>
+        <w:t>DATE</w:t>
       </w:r>
       <w:r>
         <w:rPr>
@@ -1912,20 +1940,46 @@
           <w:lang w:val="en-US"/>
         </w:rPr>
       </w:pPr>
-      <w:r>
-        <w:rPr>
-          <w:b/>
-          <w:sz w:val="28"/>
-          <w:lang w:val="en-US"/>
-        </w:rPr>
-        <w:t xml:space="preserve">Period: </w:t>
-      </w:r>
-      <w:r>
-        <w:rPr>
-          <w:sz w:val="28"/>
-          <w:lang w:val="en-US"/>
-        </w:rPr>
-        <w:t>INTEGER, NOT NULL</w:t>
+      <w:proofErr w:type="spellStart"/>
+      <w:r>
+        <w:rPr>
+          <w:b/>
+          <w:sz w:val="28"/>
+          <w:lang w:val="en-US"/>
+        </w:rPr>
+        <w:t>Contract</w:t>
+      </w:r>
+      <w:r>
+        <w:rPr>
+          <w:b/>
+          <w:sz w:val="28"/>
+          <w:lang w:val="en-US"/>
+        </w:rPr>
+        <w:t>End</w:t>
+      </w:r>
+      <w:r>
+        <w:rPr>
+          <w:b/>
+          <w:sz w:val="28"/>
+          <w:lang w:val="en-US"/>
+        </w:rPr>
+        <w:t>Day</w:t>
+      </w:r>
+      <w:proofErr w:type="spellEnd"/>
+      <w:r>
+        <w:rPr>
+          <w:b/>
+          <w:sz w:val="28"/>
+          <w:lang w:val="en-US"/>
+        </w:rPr>
+        <w:t xml:space="preserve">: </w:t>
+      </w:r>
+      <w:r>
+        <w:rPr>
+          <w:sz w:val="28"/>
+          <w:lang w:val="en-US"/>
+        </w:rPr>
+        <w:t>DATE, NOT NULL</w:t>
       </w:r>
     </w:p>
     <w:p>
@@ -2155,6 +2209,106 @@
       <w:pPr>
         <w:pStyle w:val="a3"/>
         <w:numPr>
+          <w:ilvl w:val="0"/>
+          <w:numId w:val="2"/>
+        </w:numPr>
+        <w:rPr>
+          <w:b/>
+          <w:sz w:val="28"/>
+          <w:lang w:val="en-US"/>
+        </w:rPr>
+      </w:pPr>
+      <w:r>
+        <w:rPr>
+          <w:b/>
+          <w:sz w:val="28"/>
+          <w:lang w:val="en-US"/>
+        </w:rPr>
+        <w:t>Table name:</w:t>
+      </w:r>
+      <w:r>
+        <w:rPr>
+          <w:b/>
+          <w:sz w:val="28"/>
+          <w:lang w:val="en-US"/>
+        </w:rPr>
+        <w:t xml:space="preserve"> </w:t>
+      </w:r>
+      <w:r>
+        <w:rPr>
+          <w:sz w:val="28"/>
+          <w:lang w:val="en-US"/>
+        </w:rPr>
+        <w:t>Employees</w:t>
+      </w:r>
+    </w:p>
+    <w:p>
+      <w:pPr>
+        <w:pStyle w:val="a3"/>
+        <w:numPr>
+          <w:ilvl w:val="1"/>
+          <w:numId w:val="2"/>
+        </w:numPr>
+        <w:rPr>
+          <w:b/>
+          <w:sz w:val="28"/>
+          <w:lang w:val="en-US"/>
+        </w:rPr>
+      </w:pPr>
+      <w:r>
+        <w:rPr>
+          <w:b/>
+          <w:sz w:val="28"/>
+          <w:lang w:val="en-US"/>
+        </w:rPr>
+        <w:t xml:space="preserve">Description: </w:t>
+      </w:r>
+      <w:r>
+        <w:rPr>
+          <w:sz w:val="28"/>
+        </w:rPr>
+        <w:t>Сотрудники</w:t>
+      </w:r>
+      <w:r>
+        <w:rPr>
+          <w:sz w:val="28"/>
+        </w:rPr>
+        <w:t>, обслуживающие номера</w:t>
+      </w:r>
+    </w:p>
+    <w:p>
+      <w:pPr>
+        <w:pStyle w:val="a3"/>
+        <w:numPr>
+          <w:ilvl w:val="1"/>
+          <w:numId w:val="2"/>
+        </w:numPr>
+        <w:rPr>
+          <w:b/>
+          <w:sz w:val="28"/>
+          <w:lang w:val="en-US"/>
+        </w:rPr>
+      </w:pPr>
+      <w:r>
+        <w:rPr>
+          <w:b/>
+          <w:sz w:val="28"/>
+          <w:lang w:val="en-US"/>
+        </w:rPr>
+        <w:t>Attributes:</w:t>
+      </w:r>
+      <w:r>
+        <w:rPr>
+          <w:sz w:val="28"/>
+          <w:lang w:val="en-US"/>
+        </w:rPr>
+        <w:t xml:space="preserve"> </w:t>
+      </w:r>
+    </w:p>
+    <w:p>
+      <w:pPr>
+        <w:pStyle w:val="a3"/>
+        <w:numPr>
           <w:ilvl w:val="2"/>
           <w:numId w:val="2"/>
         </w:numPr>
@@ -2170,51 +2324,295 @@
           <w:sz w:val="28"/>
           <w:lang w:val="en-US"/>
         </w:rPr>
-        <w:t xml:space="preserve">CHK_Period: </w:t>
-      </w:r>
-      <w:r>
-        <w:rPr>
-          <w:sz w:val="28"/>
-          <w:lang w:val="en-US"/>
-        </w:rPr>
-        <w:t>CHECK (Period &gt;=3)</w:t>
-      </w:r>
-    </w:p>
-    <w:p>
-      <w:pPr>
-        <w:pStyle w:val="a3"/>
-        <w:numPr>
-          <w:ilvl w:val="0"/>
-          <w:numId w:val="2"/>
-        </w:numPr>
-        <w:rPr>
-          <w:b/>
-          <w:sz w:val="28"/>
-          <w:lang w:val="en-US"/>
-        </w:rPr>
-      </w:pPr>
-      <w:r>
-        <w:rPr>
-          <w:b/>
-          <w:sz w:val="28"/>
-          <w:lang w:val="en-US"/>
-        </w:rPr>
-        <w:t>Table name:</w:t>
-      </w:r>
-      <w:r>
-        <w:rPr>
-          <w:b/>
+        <w:t xml:space="preserve">EmployeeId: </w:t>
+      </w:r>
+      <w:r>
+        <w:rPr>
+          <w:sz w:val="28"/>
+          <w:lang w:val="en-US"/>
+        </w:rPr>
+        <w:t>INTEGER, PK</w:t>
+      </w:r>
+    </w:p>
+    <w:p>
+      <w:pPr>
+        <w:pStyle w:val="a3"/>
+        <w:numPr>
+          <w:ilvl w:val="2"/>
+          <w:numId w:val="2"/>
+        </w:numPr>
+        <w:rPr>
+          <w:sz w:val="28"/>
+          <w:lang w:val="en-US"/>
+        </w:rPr>
+      </w:pPr>
+      <w:proofErr w:type="spellStart"/>
+      <w:r>
+        <w:rPr>
+          <w:b/>
+          <w:sz w:val="28"/>
+          <w:lang w:val="en-US"/>
+        </w:rPr>
+        <w:t>PassportId</w:t>
+      </w:r>
+      <w:proofErr w:type="spellEnd"/>
+      <w:r>
+        <w:rPr>
+          <w:b/>
+          <w:sz w:val="28"/>
+          <w:lang w:val="en-US"/>
+        </w:rPr>
+        <w:t>:</w:t>
+      </w:r>
+      <w:r>
+        <w:rPr>
+          <w:sz w:val="28"/>
+          <w:lang w:val="en-US"/>
+        </w:rPr>
+        <w:t xml:space="preserve"> INTEGER,</w:t>
+      </w:r>
+      <w:r>
+        <w:rPr>
+          <w:sz w:val="28"/>
+          <w:lang w:val="en-US"/>
+        </w:rPr>
+        <w:t xml:space="preserve"> NOT NULL</w:t>
+      </w:r>
+      <w:r>
+        <w:rPr>
+          <w:sz w:val="28"/>
+          <w:lang w:val="en-US"/>
+        </w:rPr>
+        <w:t xml:space="preserve"> UNIQUE</w:t>
+      </w:r>
+    </w:p>
+    <w:p>
+      <w:pPr>
+        <w:pStyle w:val="a3"/>
+        <w:numPr>
+          <w:ilvl w:val="2"/>
+          <w:numId w:val="2"/>
+        </w:numPr>
+        <w:rPr>
+          <w:sz w:val="28"/>
+          <w:lang w:val="en-US"/>
+        </w:rPr>
+      </w:pPr>
+      <w:r>
+        <w:rPr>
+          <w:b/>
+          <w:sz w:val="28"/>
+          <w:lang w:val="en-US"/>
+        </w:rPr>
+        <w:t>Email:</w:t>
+      </w:r>
+      <w:r>
+        <w:rPr>
           <w:sz w:val="28"/>
           <w:lang w:val="en-US"/>
         </w:rPr>
         <w:t xml:space="preserve"> </w:t>
       </w:r>
-      <w:r>
-        <w:rPr>
-          <w:sz w:val="28"/>
-          <w:lang w:val="en-US"/>
-        </w:rPr>
-        <w:t>Employees</w:t>
+      <w:proofErr w:type="gramStart"/>
+      <w:r>
+        <w:rPr>
+          <w:sz w:val="28"/>
+        </w:rPr>
+        <w:t>VARCHAR(</w:t>
+      </w:r>
+      <w:proofErr w:type="gramEnd"/>
+      <w:r>
+        <w:rPr>
+          <w:sz w:val="28"/>
+        </w:rPr>
+        <w:t>255), UNIQUE</w:t>
+      </w:r>
+    </w:p>
+    <w:p>
+      <w:pPr>
+        <w:pStyle w:val="a3"/>
+        <w:numPr>
+          <w:ilvl w:val="2"/>
+          <w:numId w:val="2"/>
+        </w:numPr>
+        <w:rPr>
+          <w:b/>
+          <w:sz w:val="28"/>
+          <w:lang w:val="en-US"/>
+        </w:rPr>
+      </w:pPr>
+      <w:r>
+        <w:rPr>
+          <w:b/>
+          <w:sz w:val="28"/>
+          <w:lang w:val="en-US"/>
+        </w:rPr>
+        <w:t xml:space="preserve">First name: </w:t>
+      </w:r>
+      <w:proofErr w:type="gramStart"/>
+      <w:r>
+        <w:rPr>
+          <w:sz w:val="28"/>
+          <w:lang w:val="en-US"/>
+        </w:rPr>
+        <w:t>VARCHAR(</w:t>
+      </w:r>
+      <w:proofErr w:type="gramEnd"/>
+      <w:r>
+        <w:rPr>
+          <w:sz w:val="28"/>
+          <w:lang w:val="en-US"/>
+        </w:rPr>
+        <w:t>50), NOT NULL</w:t>
+      </w:r>
+    </w:p>
+    <w:p>
+      <w:pPr>
+        <w:pStyle w:val="a3"/>
+        <w:numPr>
+          <w:ilvl w:val="2"/>
+          <w:numId w:val="2"/>
+        </w:numPr>
+        <w:rPr>
+          <w:b/>
+          <w:sz w:val="28"/>
+          <w:lang w:val="en-US"/>
+        </w:rPr>
+      </w:pPr>
+      <w:r>
+        <w:rPr>
+          <w:b/>
+          <w:sz w:val="28"/>
+          <w:lang w:val="en-US"/>
+        </w:rPr>
+        <w:lastRenderedPageBreak/>
+        <w:t>Last name:</w:t>
+      </w:r>
+      <w:r>
+        <w:rPr>
+          <w:sz w:val="28"/>
+          <w:lang w:val="en-US"/>
+        </w:rPr>
+        <w:t xml:space="preserve"> </w:t>
+      </w:r>
+      <w:proofErr w:type="gramStart"/>
+      <w:r>
+        <w:rPr>
+          <w:sz w:val="28"/>
+          <w:lang w:val="en-US"/>
+        </w:rPr>
+        <w:t>VARCHAR(</w:t>
+      </w:r>
+      <w:proofErr w:type="gramEnd"/>
+      <w:r>
+        <w:rPr>
+          <w:sz w:val="28"/>
+          <w:lang w:val="en-US"/>
+        </w:rPr>
+        <w:t>50), NOT NULL</w:t>
+      </w:r>
+    </w:p>
+    <w:p>
+      <w:pPr>
+        <w:pStyle w:val="a3"/>
+        <w:numPr>
+          <w:ilvl w:val="2"/>
+          <w:numId w:val="2"/>
+        </w:numPr>
+        <w:rPr>
+          <w:b/>
+          <w:sz w:val="28"/>
+          <w:lang w:val="en-US"/>
+        </w:rPr>
+      </w:pPr>
+      <w:r>
+        <w:rPr>
+          <w:b/>
+          <w:sz w:val="28"/>
+          <w:lang w:val="en-US"/>
+        </w:rPr>
+        <w:t>Employment type:</w:t>
+      </w:r>
+      <w:r>
+        <w:rPr>
+          <w:sz w:val="28"/>
+          <w:lang w:val="en-US"/>
+        </w:rPr>
+        <w:t xml:space="preserve"> </w:t>
+      </w:r>
+      <w:proofErr w:type="gramStart"/>
+      <w:r>
+        <w:rPr>
+          <w:sz w:val="28"/>
+          <w:lang w:val="en-US"/>
+        </w:rPr>
+        <w:t>VARCHAR(</w:t>
+      </w:r>
+      <w:proofErr w:type="gramEnd"/>
+      <w:r>
+        <w:rPr>
+          <w:sz w:val="28"/>
+          <w:lang w:val="en-US"/>
+        </w:rPr>
+        <w:t>100), NOT NULL</w:t>
+      </w:r>
+    </w:p>
+    <w:p>
+      <w:pPr>
+        <w:pStyle w:val="a3"/>
+        <w:numPr>
+          <w:ilvl w:val="2"/>
+          <w:numId w:val="2"/>
+        </w:numPr>
+        <w:rPr>
+          <w:b/>
+          <w:sz w:val="28"/>
+          <w:lang w:val="en-US"/>
+        </w:rPr>
+      </w:pPr>
+      <w:r>
+        <w:rPr>
+          <w:b/>
+          <w:sz w:val="28"/>
+          <w:lang w:val="en-US"/>
+        </w:rPr>
+        <w:t>Contract term:</w:t>
+      </w:r>
+      <w:r>
+        <w:rPr>
+          <w:sz w:val="28"/>
+          <w:lang w:val="en-US"/>
+        </w:rPr>
+        <w:t xml:space="preserve"> DATE, NOT NULL</w:t>
+      </w:r>
+    </w:p>
+    <w:p>
+      <w:pPr>
+        <w:pStyle w:val="a3"/>
+        <w:numPr>
+          <w:ilvl w:val="2"/>
+          <w:numId w:val="2"/>
+        </w:numPr>
+        <w:rPr>
+          <w:b/>
+          <w:sz w:val="28"/>
+          <w:lang w:val="en-US"/>
+        </w:rPr>
+      </w:pPr>
+      <w:r>
+        <w:rPr>
+          <w:b/>
+          <w:sz w:val="28"/>
+          <w:lang w:val="en-US"/>
+        </w:rPr>
+        <w:t xml:space="preserve">Hire date: </w:t>
+      </w:r>
+      <w:r>
+        <w:rPr>
+          <w:sz w:val="28"/>
+          <w:lang w:val="en-US"/>
+        </w:rPr>
+        <w:t>DATE, NOT NULL</w:t>
       </w:r>
     </w:p>
     <w:p>
@@ -2236,48 +2634,7 @@
           <w:sz w:val="28"/>
           <w:lang w:val="en-US"/>
         </w:rPr>
-        <w:t xml:space="preserve">Description: </w:t>
-      </w:r>
-      <w:r>
-        <w:rPr>
-          <w:sz w:val="28"/>
-        </w:rPr>
-        <w:t>Сотрудники</w:t>
-      </w:r>
-      <w:r>
-        <w:rPr>
-          <w:sz w:val="28"/>
-        </w:rPr>
-        <w:t>, обслуживающие номера</w:t>
-      </w:r>
-    </w:p>
-    <w:p>
-      <w:pPr>
-        <w:pStyle w:val="a3"/>
-        <w:numPr>
-          <w:ilvl w:val="1"/>
-          <w:numId w:val="2"/>
-        </w:numPr>
-        <w:rPr>
-          <w:b/>
-          <w:sz w:val="28"/>
-          <w:lang w:val="en-US"/>
-        </w:rPr>
-      </w:pPr>
-      <w:r>
-        <w:rPr>
-          <w:b/>
-          <w:sz w:val="28"/>
-          <w:lang w:val="en-US"/>
-        </w:rPr>
-        <w:t>Attributes:</w:t>
-      </w:r>
-      <w:r>
-        <w:rPr>
-          <w:sz w:val="28"/>
-          <w:lang w:val="en-US"/>
-        </w:rPr>
-        <w:t xml:space="preserve"> </w:t>
+        <w:t>Constrains:</w:t>
       </w:r>
     </w:p>
     <w:p>
@@ -2299,14 +2656,14 @@
           <w:sz w:val="28"/>
           <w:lang w:val="en-US"/>
         </w:rPr>
-        <w:t xml:space="preserve">EmployeeId: </w:t>
-      </w:r>
-      <w:r>
-        <w:rPr>
-          <w:sz w:val="28"/>
-          <w:lang w:val="en-US"/>
-        </w:rPr>
-        <w:t>INTEGER, PK</w:t>
+        <w:t xml:space="preserve">PK_EmployeeId: </w:t>
+      </w:r>
+      <w:r>
+        <w:rPr>
+          <w:sz w:val="28"/>
+          <w:lang w:val="en-US"/>
+        </w:rPr>
+        <w:t>PRIMARY KEY (EmployeeId)</w:t>
       </w:r>
     </w:p>
     <w:p>
@@ -2317,405 +2674,13 @@
           <w:numId w:val="2"/>
         </w:numPr>
         <w:rPr>
-          <w:sz w:val="28"/>
-          <w:lang w:val="en-US"/>
-        </w:rPr>
-      </w:pPr>
-      <w:r>
-        <w:rPr>
-          <w:b/>
-          <w:sz w:val="28"/>
-          <w:lang w:val="en-US"/>
-        </w:rPr>
-        <w:t>PassportId:</w:t>
-      </w:r>
-      <w:r>
-        <w:rPr>
-          <w:sz w:val="28"/>
-          <w:lang w:val="en-US"/>
-        </w:rPr>
-        <w:t xml:space="preserve"> INTEGER, UNIQUE</w:t>
-      </w:r>
-    </w:p>
-    <w:p>
-      <w:pPr>
-        <w:pStyle w:val="a3"/>
-        <w:numPr>
-          <w:ilvl w:val="2"/>
-          <w:numId w:val="2"/>
-        </w:numPr>
-        <w:rPr>
-          <w:sz w:val="28"/>
-          <w:lang w:val="en-US"/>
-        </w:rPr>
-      </w:pPr>
-      <w:r>
-        <w:rPr>
-          <w:b/>
-          <w:sz w:val="28"/>
-          <w:lang w:val="en-US"/>
-        </w:rPr>
-        <w:t>Email:</w:t>
-      </w:r>
-      <w:r>
-        <w:rPr>
-          <w:sz w:val="28"/>
-          <w:lang w:val="en-US"/>
-        </w:rPr>
-        <w:t xml:space="preserve"> </w:t>
-      </w:r>
-      <w:proofErr w:type="gramStart"/>
-      <w:r>
-        <w:rPr>
-          <w:sz w:val="28"/>
-        </w:rPr>
-        <w:t>VARCHAR(</w:t>
-      </w:r>
-      <w:proofErr w:type="gramEnd"/>
-      <w:r>
-        <w:rPr>
-          <w:sz w:val="28"/>
-        </w:rPr>
-        <w:t>255), UNIQUE</w:t>
-      </w:r>
-    </w:p>
-    <w:p>
-      <w:pPr>
-        <w:pStyle w:val="a3"/>
-        <w:numPr>
-          <w:ilvl w:val="2"/>
-          <w:numId w:val="2"/>
-        </w:numPr>
-        <w:rPr>
-          <w:b/>
-          <w:sz w:val="28"/>
-          <w:lang w:val="en-US"/>
-        </w:rPr>
-      </w:pPr>
-      <w:r>
-        <w:rPr>
-          <w:b/>
-          <w:sz w:val="28"/>
-          <w:lang w:val="en-US"/>
-        </w:rPr>
-        <w:lastRenderedPageBreak/>
-        <w:t xml:space="preserve">First name: </w:t>
-      </w:r>
-      <w:proofErr w:type="gramStart"/>
-      <w:r>
-        <w:rPr>
-          <w:sz w:val="28"/>
-          <w:lang w:val="en-US"/>
-        </w:rPr>
-        <w:t>VARCHAR(</w:t>
-      </w:r>
-      <w:proofErr w:type="gramEnd"/>
-      <w:r>
-        <w:rPr>
-          <w:sz w:val="28"/>
-          <w:lang w:val="en-US"/>
-        </w:rPr>
-        <w:t>50), NOT NULL</w:t>
-      </w:r>
-    </w:p>
-    <w:p>
-      <w:pPr>
-        <w:pStyle w:val="a3"/>
-        <w:numPr>
-          <w:ilvl w:val="2"/>
-          <w:numId w:val="2"/>
-        </w:numPr>
-        <w:rPr>
-          <w:b/>
-          <w:sz w:val="28"/>
-          <w:lang w:val="en-US"/>
-        </w:rPr>
-      </w:pPr>
-      <w:r>
-        <w:rPr>
-          <w:b/>
-          <w:sz w:val="28"/>
-          <w:lang w:val="en-US"/>
-        </w:rPr>
-        <w:t>Last name:</w:t>
-      </w:r>
-      <w:r>
-        <w:rPr>
-          <w:sz w:val="28"/>
-          <w:lang w:val="en-US"/>
-        </w:rPr>
-        <w:t xml:space="preserve"> </w:t>
-      </w:r>
-      <w:proofErr w:type="gramStart"/>
-      <w:r>
-        <w:rPr>
-          <w:sz w:val="28"/>
-          <w:lang w:val="en-US"/>
-        </w:rPr>
-        <w:t>VARCHAR(</w:t>
-      </w:r>
-      <w:proofErr w:type="gramEnd"/>
-      <w:r>
-        <w:rPr>
-          <w:sz w:val="28"/>
-          <w:lang w:val="en-US"/>
-        </w:rPr>
-        <w:t>50), NOT NULL</w:t>
-      </w:r>
-    </w:p>
-    <w:p>
-      <w:pPr>
-        <w:pStyle w:val="a3"/>
-        <w:numPr>
-          <w:ilvl w:val="2"/>
-          <w:numId w:val="2"/>
-        </w:numPr>
-        <w:rPr>
-          <w:b/>
-          <w:sz w:val="28"/>
-          <w:lang w:val="en-US"/>
-        </w:rPr>
-      </w:pPr>
-      <w:r>
-        <w:rPr>
-          <w:b/>
-          <w:sz w:val="28"/>
-          <w:lang w:val="en-US"/>
-        </w:rPr>
-        <w:t>Employment type:</w:t>
-      </w:r>
-      <w:r>
-        <w:rPr>
-          <w:sz w:val="28"/>
-          <w:lang w:val="en-US"/>
-        </w:rPr>
-        <w:t xml:space="preserve"> </w:t>
-      </w:r>
-      <w:proofErr w:type="gramStart"/>
-      <w:r>
-        <w:rPr>
-          <w:sz w:val="28"/>
-          <w:lang w:val="en-US"/>
-        </w:rPr>
-        <w:t>VARCHAR(</w:t>
-      </w:r>
-      <w:proofErr w:type="gramEnd"/>
-      <w:r>
-        <w:rPr>
-          <w:sz w:val="28"/>
-          <w:lang w:val="en-US"/>
-        </w:rPr>
-        <w:t>100), NOT NULL</w:t>
-      </w:r>
-    </w:p>
-    <w:p>
-      <w:pPr>
-        <w:pStyle w:val="a3"/>
-        <w:numPr>
-          <w:ilvl w:val="2"/>
-          <w:numId w:val="2"/>
-        </w:numPr>
-        <w:rPr>
-          <w:b/>
-          <w:sz w:val="28"/>
-          <w:lang w:val="en-US"/>
-        </w:rPr>
-      </w:pPr>
-      <w:r>
-        <w:rPr>
-          <w:b/>
-          <w:sz w:val="28"/>
-          <w:lang w:val="en-US"/>
-        </w:rPr>
-        <w:t>Contract term:</w:t>
-      </w:r>
-      <w:r>
-        <w:rPr>
-          <w:sz w:val="28"/>
-          <w:lang w:val="en-US"/>
-        </w:rPr>
-        <w:t xml:space="preserve"> DATE, NOT NULL</w:t>
-      </w:r>
-    </w:p>
-    <w:p>
-      <w:pPr>
-        <w:pStyle w:val="a3"/>
-        <w:numPr>
-          <w:ilvl w:val="2"/>
-          <w:numId w:val="2"/>
-        </w:numPr>
-        <w:rPr>
-          <w:b/>
-          <w:sz w:val="28"/>
-          <w:lang w:val="en-US"/>
-        </w:rPr>
-      </w:pPr>
-      <w:r>
-        <w:rPr>
-          <w:b/>
-          <w:sz w:val="28"/>
-          <w:lang w:val="en-US"/>
-        </w:rPr>
-        <w:t xml:space="preserve">Hire date: </w:t>
-      </w:r>
-      <w:r>
-        <w:rPr>
-          <w:sz w:val="28"/>
-          <w:lang w:val="en-US"/>
-        </w:rPr>
-        <w:t>DATE, NOT NULL</w:t>
-      </w:r>
-    </w:p>
-    <w:p>
-      <w:pPr>
-        <w:pStyle w:val="a3"/>
-        <w:numPr>
-          <w:ilvl w:val="1"/>
-          <w:numId w:val="2"/>
-        </w:numPr>
-        <w:rPr>
-          <w:b/>
-          <w:sz w:val="28"/>
-          <w:lang w:val="en-US"/>
-        </w:rPr>
-      </w:pPr>
-      <w:r>
-        <w:rPr>
-          <w:b/>
-          <w:sz w:val="28"/>
-          <w:lang w:val="en-US"/>
-        </w:rPr>
-        <w:t>Constrains:</w:t>
-      </w:r>
-    </w:p>
-    <w:p>
-      <w:pPr>
-        <w:pStyle w:val="a3"/>
-        <w:numPr>
-          <w:ilvl w:val="2"/>
-          <w:numId w:val="2"/>
-        </w:numPr>
-        <w:rPr>
-          <w:b/>
-          <w:sz w:val="28"/>
-          <w:lang w:val="en-US"/>
-        </w:rPr>
-      </w:pPr>
-      <w:r>
-        <w:rPr>
-          <w:b/>
-          <w:sz w:val="28"/>
-          <w:lang w:val="en-US"/>
-        </w:rPr>
-        <w:t xml:space="preserve">PK_EmployeeId: </w:t>
-      </w:r>
-      <w:r>
-        <w:rPr>
-          <w:sz w:val="28"/>
-          <w:lang w:val="en-US"/>
-        </w:rPr>
-        <w:t>PRIMARY KEY (EmployeeId)</w:t>
-      </w:r>
-    </w:p>
-    <w:p>
-      <w:pPr>
-        <w:pStyle w:val="a3"/>
-        <w:numPr>
-          <w:ilvl w:val="2"/>
-          <w:numId w:val="2"/>
-        </w:numPr>
-        <w:rPr>
-          <w:b/>
-          <w:sz w:val="28"/>
-          <w:lang w:val="en-US"/>
-        </w:rPr>
-      </w:pPr>
-      <w:r>
-        <w:rPr>
-          <w:b/>
-          <w:sz w:val="28"/>
-          <w:lang w:val="en-US"/>
-        </w:rPr>
-        <w:t xml:space="preserve">CHK_ContractTerm: </w:t>
-      </w:r>
-      <w:r>
-        <w:rPr>
-          <w:sz w:val="28"/>
-          <w:lang w:val="en-US"/>
-        </w:rPr>
-        <w:t xml:space="preserve">CHECK (Contract term </w:t>
-      </w:r>
-      <w:r>
-        <w:rPr>
-          <w:sz w:val="28"/>
-          <w:lang w:val="en-US"/>
-        </w:rPr>
-        <w:t>&gt;</w:t>
-      </w:r>
-      <w:r>
-        <w:rPr>
-          <w:sz w:val="28"/>
-          <w:lang w:val="en-US"/>
-        </w:rPr>
-        <w:t>= CURRENT DATE</w:t>
-      </w:r>
-      <w:r>
-        <w:rPr>
-          <w:sz w:val="28"/>
-          <w:lang w:val="en-US"/>
-        </w:rPr>
-        <w:t xml:space="preserve"> AND Contract term &gt;= Hire date</w:t>
-      </w:r>
-      <w:r>
-        <w:rPr>
-          <w:sz w:val="28"/>
-          <w:lang w:val="en-US"/>
-        </w:rPr>
-        <w:t>)</w:t>
-      </w:r>
-    </w:p>
-    <w:p>
-      <w:pPr>
-        <w:pStyle w:val="a3"/>
-        <w:numPr>
-          <w:ilvl w:val="2"/>
-          <w:numId w:val="2"/>
-        </w:numPr>
-        <w:rPr>
-          <w:b/>
-          <w:sz w:val="28"/>
-          <w:lang w:val="en-US"/>
-        </w:rPr>
-      </w:pPr>
-      <w:r>
-        <w:rPr>
-          <w:b/>
-          <w:sz w:val="28"/>
-          <w:lang w:val="en-US"/>
-        </w:rPr>
-        <w:t xml:space="preserve">CHK_HireDate: </w:t>
-      </w:r>
-      <w:r>
-        <w:rPr>
-          <w:sz w:val="28"/>
-          <w:lang w:val="en-US"/>
-        </w:rPr>
-        <w:t>CHECK (Hire date &lt;= CURRENT DATE)</w:t>
-      </w:r>
-    </w:p>
-    <w:p>
-      <w:pPr>
-        <w:pStyle w:val="a3"/>
-        <w:numPr>
-          <w:ilvl w:val="2"/>
-          <w:numId w:val="2"/>
-        </w:numPr>
-        <w:rPr>
-          <w:b/>
-          <w:sz w:val="28"/>
-          <w:lang w:val="en-US"/>
-        </w:rPr>
-      </w:pPr>
+          <w:b/>
+          <w:sz w:val="28"/>
+          <w:lang w:val="en-US"/>
+        </w:rPr>
+      </w:pPr>
+      <w:bookmarkStart w:id="1" w:name="_GoBack"/>
+      <w:bookmarkEnd w:id="1"/>
       <w:r>
         <w:rPr>
           <w:b/>
@@ -3490,7 +3455,6 @@
           <w:bdr w:val="none" w:sz="0" w:space="0" w:color="auto" w:frame="1"/>
           <w:lang w:eastAsia="ru-RU"/>
         </w:rPr>
-        <w:lastRenderedPageBreak/>
         <w:t>Tenants</w:t>
       </w:r>
       <w:proofErr w:type="spellEnd"/>
@@ -3563,6 +3527,7 @@
           <w:bdr w:val="none" w:sz="0" w:space="0" w:color="auto" w:frame="1"/>
           <w:lang w:eastAsia="ru-RU"/>
         </w:rPr>
+        <w:lastRenderedPageBreak/>
         <w:t>Requests.TenantId</w:t>
       </w:r>
       <w:proofErr w:type="spellEnd"/>
@@ -4091,7 +4056,6 @@
         <w:rPr>
           <w:sz w:val="28"/>
         </w:rPr>
-        <w:lastRenderedPageBreak/>
         <w:t xml:space="preserve">Система ведёт справочники арендаторов и объектов недвижимости с проверкой уникальности контактов и паспортных данных. Управление договорами (таблица </w:t>
       </w:r>
       <w:proofErr w:type="spellStart"/>
@@ -4108,7 +4072,14 @@
         <w:rPr>
           <w:sz w:val="28"/>
         </w:rPr>
-        <w:t>) фиксирует связь арендатора с объектом, хранит текст договора и контролирует срок аренды, предотвращая конфликтные бронирования.</w:t>
+        <w:t xml:space="preserve">) фиксирует связь арендатора с объектом, </w:t>
+      </w:r>
+      <w:r>
+        <w:rPr>
+          <w:sz w:val="28"/>
+        </w:rPr>
+        <w:lastRenderedPageBreak/>
+        <w:t>хранит текст договора и контролирует срок аренды, предотвращая конфликтные бронирования.</w:t>
       </w:r>
     </w:p>
     <w:p>
@@ -4191,7 +4162,6 @@
       <w:pPr>
         <w:rPr>
           <w:sz w:val="28"/>
-          <w:lang w:val="en-US"/>
         </w:rPr>
       </w:pPr>
     </w:p>

</xml_diff>

<commit_message>
feat: Addend constrains in diagram and in some fields
</commit_message>
<xml_diff>
--- a/inno-de-lab_task_2/УПРАВЛЕНИЕ АРЕНДНОЙ НЕДВИЖИМОСТЬЮ.docx
+++ b/inno-de-lab_task_2/УПРАВЛЕНИЕ АРЕНДНОЙ НЕДВИЖИМОСТЬЮ.docx
@@ -959,6 +959,20 @@
         </w:rPr>
         <w:t>INTEGER, NOT NULL</w:t>
       </w:r>
+      <w:r>
+        <w:rPr>
+          <w:sz w:val="28"/>
+          <w:lang w:val="en-US"/>
+        </w:rPr>
+        <w:t xml:space="preserve">, </w:t>
+      </w:r>
+      <w:r>
+        <w:rPr>
+          <w:sz w:val="28"/>
+          <w:lang w:val="en-US"/>
+        </w:rPr>
+        <w:t>CHECK (Rooms &gt; 0)</w:t>
+      </w:r>
     </w:p>
     <w:p>
       <w:pPr>
@@ -994,6 +1008,36 @@
           <w:lang w:val="en-US"/>
         </w:rPr>
         <w:t>, NOT NULL</w:t>
+      </w:r>
+      <w:r>
+        <w:rPr>
+          <w:sz w:val="28"/>
+          <w:lang w:val="en-US"/>
+        </w:rPr>
+        <w:t xml:space="preserve">, </w:t>
+      </w:r>
+      <w:r>
+        <w:rPr>
+          <w:sz w:val="28"/>
+          <w:lang w:val="en-US"/>
+        </w:rPr>
+        <w:t>CHECK (</w:t>
+      </w:r>
+      <w:r>
+        <w:rPr>
+          <w:sz w:val="28"/>
+          <w:lang w:val="en-US"/>
+        </w:rPr>
+        <w:t>Area</w:t>
+      </w:r>
+      <w:bookmarkStart w:id="0" w:name="_GoBack"/>
+      <w:bookmarkEnd w:id="0"/>
+      <w:r>
+        <w:rPr>
+          <w:sz w:val="28"/>
+          <w:lang w:val="en-US"/>
+        </w:rPr>
+        <w:t xml:space="preserve"> &gt; 0)</w:t>
       </w:r>
     </w:p>
     <w:p>
@@ -1554,7 +1598,7 @@
         </w:rPr>
         <w:t>PK_</w:t>
       </w:r>
-      <w:bookmarkStart w:id="0" w:name="_Hlk237161244"/>
+      <w:bookmarkStart w:id="1" w:name="_Hlk237161244"/>
       <w:r>
         <w:rPr>
           <w:b/>
@@ -1563,7 +1607,7 @@
         </w:rPr>
         <w:t>RequestId</w:t>
       </w:r>
-      <w:bookmarkEnd w:id="0"/>
+      <w:bookmarkEnd w:id="1"/>
       <w:r>
         <w:rPr>
           <w:b/>
@@ -2679,8 +2723,6 @@
           <w:lang w:val="en-US"/>
         </w:rPr>
       </w:pPr>
-      <w:bookmarkStart w:id="1" w:name="_GoBack"/>
-      <w:bookmarkEnd w:id="1"/>
       <w:r>
         <w:rPr>
           <w:b/>
@@ -3962,9 +4004,9 @@
         </w:rPr>
         <w:drawing>
           <wp:inline distT="0" distB="0" distL="0" distR="0">
-            <wp:extent cx="5940425" cy="2141220"/>
-            <wp:effectExtent l="0" t="0" r="3175" b="0"/>
-            <wp:docPr id="2" name="Рисунок 2"/>
+            <wp:extent cx="5934710" cy="4489450"/>
+            <wp:effectExtent l="0" t="0" r="8890" b="6350"/>
+            <wp:docPr id="1" name="Рисунок 1"/>
             <wp:cNvGraphicFramePr>
               <a:graphicFrameLocks xmlns:a="http://schemas.openxmlformats.org/drawingml/2006/main" noChangeAspect="1"/>
             </wp:cNvGraphicFramePr>
@@ -3972,7 +4014,7 @@
               <a:graphicData uri="http://schemas.openxmlformats.org/drawingml/2006/picture">
                 <pic:pic xmlns:pic="http://schemas.openxmlformats.org/drawingml/2006/picture">
                   <pic:nvPicPr>
-                    <pic:cNvPr id="0" name="Picture 5"/>
+                    <pic:cNvPr id="0" name="Picture 1"/>
                     <pic:cNvPicPr>
                       <a:picLocks noChangeAspect="1" noChangeArrowheads="1"/>
                     </pic:cNvPicPr>
@@ -3993,7 +4035,7 @@
                   <pic:spPr bwMode="auto">
                     <a:xfrm>
                       <a:off x="0" y="0"/>
-                      <a:ext cx="5940425" cy="2141220"/>
+                      <a:ext cx="5934710" cy="4489450"/>
                     </a:xfrm>
                     <a:prstGeom prst="rect">
                       <a:avLst/>
@@ -4013,14 +4055,6 @@
     <w:p>
       <w:pPr>
         <w:rPr>
-          <w:b/>
-          <w:sz w:val="28"/>
-        </w:rPr>
-      </w:pPr>
-    </w:p>
-    <w:p>
-      <w:pPr>
-        <w:rPr>
           <w:sz w:val="28"/>
         </w:rPr>
       </w:pPr>
@@ -4030,6 +4064,7 @@
           <w:bCs/>
           <w:sz w:val="28"/>
         </w:rPr>
+        <w:lastRenderedPageBreak/>
         <w:t>Цели и задачи системы</w:t>
       </w:r>
     </w:p>
@@ -4072,14 +4107,7 @@
         <w:rPr>
           <w:sz w:val="28"/>
         </w:rPr>
-        <w:t xml:space="preserve">) фиксирует связь арендатора с объектом, </w:t>
-      </w:r>
-      <w:r>
-        <w:rPr>
-          <w:sz w:val="28"/>
-        </w:rPr>
-        <w:lastRenderedPageBreak/>
-        <w:t>хранит текст договора и контролирует срок аренды, предотвращая конфликтные бронирования.</w:t>
+        <w:t>) фиксирует связь арендатора с объектом, хранит текст договора и контролирует срок аренды, предотвращая конфликтные бронирования.</w:t>
       </w:r>
     </w:p>
     <w:p>

</xml_diff>